<commit_message>
docx: update all Word documents directly with MECE 5D container proof and computational irreducibility uniqueness proof
</commit_message>
<xml_diff>
--- a/the_holographic_anti_entropy_system_science_paper.docx
+++ b/the_holographic_anti_entropy_system_science_paper.docx
@@ -2674,63 +2674,18 @@
       </w:r>
     </w:p>
     <w:p>
-      <w:pPr>
-        <w:spacing w:line="300" w:lineRule="auto" w:after="120"/>
-      </w:pPr>
-      <w:r>
-        <w:rPr>
-          <w:rFonts w:ascii="Times New Roman" w:hAnsi="Times New Roman" w:eastAsia="宋体"/>
-          <w:b w:val="0"/>
-          <w:i w:val="0"/>
-          <w:sz w:val="22"/>
-        </w:rPr>
-        <w:t>基于该 5D 容器，我们将系统科学中统治物质流与因果链的三大底座公理形式化证明如下：</w:t>
+      <w:r>
+        <w:t>其中，此五维正交容器 $D$ 满足严格的 MECE（相互独立，完全穷尽）全息完备性：</w:t>
       </w:r>
     </w:p>
     <w:p>
-      <w:pPr>
-        <w:spacing w:before="120" w:after="80"/>
-      </w:pPr>
-      <w:r>
-        <w:rPr>
-          <w:rFonts w:ascii="Times New Roman" w:hAnsi="Times New Roman" w:eastAsia="宋体"/>
-          <w:b/>
-          <w:i w:val="0"/>
-          <w:sz w:val="24"/>
-        </w:rPr>
-        <w:t>5.1 定理四：物料守恒的“时空拓扑度量”同构定理</w:t>
+      <w:r>
+        <w:t>• 相互独立 (Mutually Exclusive)：节点 $V_D$（无拓扑实体）、拓扑 $E_D$（静态无时延路由）、约束 $C_D$（可行解域边界）、状态跃迁 $T_D$（离散演化动力）与状态矢量 $\mathbf{x}_D$（瞬时坐标快照）分别描述不同的系统动力学物理自由度，语义互斥且在代数上正交。</w:t>
       </w:r>
     </w:p>
     <w:p>
-      <w:pPr>
-        <w:spacing w:line="300" w:lineRule="auto" w:after="120"/>
-      </w:pPr>
-      <w:r>
-        <w:rPr>
-          <w:rFonts w:ascii="Times New Roman" w:hAnsi="Times New Roman" w:eastAsia="宋体"/>
-          <w:b w:val="0"/>
-          <w:i w:val="0"/>
-          <w:sz w:val="22"/>
-        </w:rPr>
-        <w:t xml:space="preserve">&gt; </w:t>
-      </w:r>
-      <w:r>
-        <w:rPr>
-          <w:rFonts w:ascii="Times New Roman" w:hAnsi="Times New Roman" w:eastAsia="宋体"/>
-          <w:b/>
-          <w:i w:val="0"/>
-          <w:sz w:val="22"/>
-        </w:rPr>
-        <w:t>【定理内容】</w:t>
-      </w:r>
-      <w:r>
-        <w:rPr>
-          <w:rFonts w:ascii="Times New Roman" w:hAnsi="Times New Roman" w:eastAsia="宋体"/>
-          <w:b w:val="0"/>
-          <w:i w:val="0"/>
-          <w:sz w:val="22"/>
-        </w:rPr>
-        <w:t>：物料守恒并非静态的数字账目加减，而是由“状态载体质点（$V_D$）”、“有向流转网络（$E_D$）”与“相变同步奇点（$T_D$）”在时空维度耦合而成的质量守恒流场。</w:t>
+      <w:r>
+        <w:t>• 完全穷尽 (Collectively Exhaustive)：任何开放自适应系统的状态空间建模，必被完备涵盖为组分拓扑（节点与拓扑）、可行解域（约束）、以及演化轨迹（跃迁与状态矢量）。无论是物理、生物还是数智价值链，其全息投影无一能脱离此五维表征。</w:t>
       </w:r>
     </w:p>
     <w:p>
@@ -2744,42 +2699,102 @@
           <w:i w:val="0"/>
           <w:sz w:val="22"/>
         </w:rPr>
-      </w:r>
-      <w:r>
-        <w:rPr>
-          <w:rFonts w:ascii="Times New Roman" w:hAnsi="Times New Roman" w:eastAsia="宋体"/>
-          <w:b/>
-          <w:i w:val="0"/>
-          <w:sz w:val="22"/>
-        </w:rPr>
-        <w:t>【证明】</w:t>
-      </w:r>
-      <w:r>
-        <w:rPr>
-          <w:rFonts w:ascii="Times New Roman" w:hAnsi="Times New Roman" w:eastAsia="宋体"/>
-          <w:b w:val="0"/>
-          <w:i w:val="0"/>
-          <w:sz w:val="22"/>
-        </w:rPr>
-        <w:t>：</w:t>
+        <w:t>基于该 5D 容器，我们将系统科学中统治物质流与因果链的三大底座公理形式化证明如下：</w:t>
       </w:r>
     </w:p>
     <w:p>
       <w:pPr>
-        <w:spacing w:line="300" w:lineRule="auto" w:after="120"/>
-      </w:pPr>
-      <w:r>
-        <w:rPr>
-          <w:rFonts w:ascii="Times New Roman" w:hAnsi="Times New Roman" w:eastAsia="宋体"/>
-          <w:b w:val="0"/>
-          <w:i w:val="0"/>
-          <w:sz w:val="22"/>
-        </w:rPr>
-        <w:t>设系统内任意物料节点 $i \in V_{\text{state}}$。在离散事件状态跃迁时刻 $t_k \in T_D$ 触发下，该物料的状态矢量分量 $x_i(t_k) \in x_D$ 的演化流方程定义为：</w:t>
+        <w:spacing w:before="120" w:after="80"/>
+      </w:pPr>
+      <w:r>
+        <w:rPr>
+          <w:rFonts w:ascii="Times New Roman" w:hAnsi="Times New Roman" w:eastAsia="宋体"/>
+          <w:b/>
+          <w:i w:val="0"/>
+          <w:sz w:val="24"/>
+        </w:rPr>
+        <w:t>5.1 定理四：物料守恒的“时空拓扑度量”同构定理</w:t>
       </w:r>
     </w:p>
     <w:p>
       <w:pPr>
+        <w:spacing w:line="300" w:lineRule="auto" w:after="120"/>
+      </w:pPr>
+      <w:r>
+        <w:rPr>
+          <w:rFonts w:ascii="Times New Roman" w:hAnsi="Times New Roman" w:eastAsia="宋体"/>
+          <w:b w:val="0"/>
+          <w:i w:val="0"/>
+          <w:sz w:val="22"/>
+        </w:rPr>
+        <w:t xml:space="preserve">&gt; </w:t>
+      </w:r>
+      <w:r>
+        <w:rPr>
+          <w:rFonts w:ascii="Times New Roman" w:hAnsi="Times New Roman" w:eastAsia="宋体"/>
+          <w:b/>
+          <w:i w:val="0"/>
+          <w:sz w:val="22"/>
+        </w:rPr>
+        <w:t>【定理内容】</w:t>
+      </w:r>
+      <w:r>
+        <w:rPr>
+          <w:rFonts w:ascii="Times New Roman" w:hAnsi="Times New Roman" w:eastAsia="宋体"/>
+          <w:b w:val="0"/>
+          <w:i w:val="0"/>
+          <w:sz w:val="22"/>
+        </w:rPr>
+        <w:t>：物料守恒并非静态的数字账目加减，而是由“状态载体质点（$V_D$）”、“有向流转网络（$E_D$）”与“相变同步奇点（$T_D$）”在时空维度耦合而成的质量守恒流场。</w:t>
+      </w:r>
+    </w:p>
+    <w:p>
+      <w:pPr>
+        <w:spacing w:line="300" w:lineRule="auto" w:after="120"/>
+      </w:pPr>
+      <w:r>
+        <w:rPr>
+          <w:rFonts w:ascii="Times New Roman" w:hAnsi="Times New Roman" w:eastAsia="宋体"/>
+          <w:b w:val="0"/>
+          <w:i w:val="0"/>
+          <w:sz w:val="22"/>
+        </w:rPr>
+      </w:r>
+      <w:r>
+        <w:rPr>
+          <w:rFonts w:ascii="Times New Roman" w:hAnsi="Times New Roman" w:eastAsia="宋体"/>
+          <w:b/>
+          <w:i w:val="0"/>
+          <w:sz w:val="22"/>
+        </w:rPr>
+        <w:t>【证明】</w:t>
+      </w:r>
+      <w:r>
+        <w:rPr>
+          <w:rFonts w:ascii="Times New Roman" w:hAnsi="Times New Roman" w:eastAsia="宋体"/>
+          <w:b w:val="0"/>
+          <w:i w:val="0"/>
+          <w:sz w:val="22"/>
+        </w:rPr>
+        <w:t>：</w:t>
+      </w:r>
+    </w:p>
+    <w:p>
+      <w:pPr>
+        <w:spacing w:line="300" w:lineRule="auto" w:after="120"/>
+      </w:pPr>
+      <w:r>
+        <w:rPr>
+          <w:rFonts w:ascii="Times New Roman" w:hAnsi="Times New Roman" w:eastAsia="宋体"/>
+          <w:b w:val="0"/>
+          <w:i w:val="0"/>
+          <w:sz w:val="22"/>
+        </w:rPr>
+        <w:t>设系统内任意物料节点 $i \in V_{\text{state}}$。在离散事件状态跃迁时刻 $t_k \in T_D$ 触发下，该物料的状态矢量分量 $x_i(t_k) \in x_D$ 的演化流方程定义为：</w:t>
+      </w:r>
+    </w:p>
+    <w:p>
+      <w:pPr>
         <w:spacing w:before="120" w:after="120"/>
         <w:jc w:val="center"/>
       </w:pPr>
@@ -3414,6 +3429,26 @@
           <w:sz w:val="22"/>
         </w:rPr>
         <w:t>：包含海量异构节点的复杂巨系统，其未来的演化无法通过某种公式直接预测。系统大脑必须在算力空间里，在内存中一步一步模拟出整个状态跃迁轨迹。而在计算不可约性的限制下，包含复杂物料替代（SWAP）与工艺路线卡尺约束的巨系统在推演时，由于每一步计算都包含复杂的条件分支，系统在最终状态会表现出极其庞大的涌现性复杂度。</w:t>
+      </w:r>
+    </w:p>
+    <w:p>
+      <w:r>
+        <w:t>计算不可约下“计算 + 条件分支 (IF-THEN-ELSE) + 再计算”唯一解性证明：</w:t>
+      </w:r>
+    </w:p>
+    <w:p>
+      <w:r>
+        <w:t>• 反证法（不存在解析捷径）：假设对于一个计算不可约且能涌现复杂秩序的巨系统，存在某种解析函数（Closed-form Equation）可以直接求解其未来相轨迹，而不需要执行任何离散的 if-then-else 步进推演。如果该解析函数存在，则系统状态变化将是计算可约的，直接违背了“计算不可约性”的前置物理公理。因此，解析捷径在物理上不存在，步进推演是唯一通道。</w:t>
+      </w:r>
+    </w:p>
+    <w:p>
+      <w:r>
+        <w:t>• 图灵完备性与非线性相变：任何涌现复杂秩序的离散动力系统等价于图灵机。根据邱奇-图灵论题，图灵完备的最小指令集必须包含数据处理（计算）与条件转移（if-then-else）。在离散计算相空间中，系统非线性动力学交互与解空间局部裁剪的唯一代数表达形式，就是基于状态因果的条件分支（IF-THEN-ELSE）。</w:t>
+      </w:r>
+    </w:p>
+    <w:p>
+      <w:r>
+        <w:t>• 因此，“顺序计算 + 条件分支 (IF-THEN-ELSE) + 再次计算”的步进推演结构，是模拟并求解计算不可约演化过程的唯一合法且必须的数学解。</w:t>
       </w:r>
     </w:p>
     <w:p>

</xml_diff>

<commit_message>
theory: explicitly state HAE's core innovation of systematizing system science into a self-evolving structural engine in all sources and Word documents
</commit_message>
<xml_diff>
--- a/the_holographic_anti_entropy_system_science_paper.docx
+++ b/the_holographic_anti_entropy_system_science_paper.docx
@@ -1696,67 +1696,7 @@
         <w:spacing w:line="300" w:lineRule="auto" w:after="120"/>
       </w:pPr>
       <w:r>
-        <w:rPr>
-          <w:rFonts w:ascii="Times New Roman" w:hAnsi="Times New Roman" w:eastAsia="宋体"/>
-          <w:b w:val="0"/>
-          <w:i w:val="0"/>
-          <w:sz w:val="22"/>
-        </w:rPr>
-        <w:t>钱学森先生在晚年高瞻远瞩地指出，治理开放复杂巨系统（OCGS）唯一的科学途径是</w:t>
-      </w:r>
-      <w:r>
-        <w:rPr>
-          <w:rFonts w:ascii="Times New Roman" w:hAnsi="Times New Roman" w:eastAsia="宋体"/>
-          <w:b/>
-          <w:i w:val="0"/>
-          <w:sz w:val="22"/>
-        </w:rPr>
-        <w:t>“从定性到定量综合集成方法（Metasynthetic Method）”</w:t>
-      </w:r>
-      <w:r>
-        <w:rPr>
-          <w:rFonts w:ascii="Times New Roman" w:hAnsi="Times New Roman" w:eastAsia="宋体"/>
-          <w:b w:val="0"/>
-          <w:i w:val="0"/>
-          <w:sz w:val="22"/>
-        </w:rPr>
-        <w:t>，并提出了</w:t>
-      </w:r>
-      <w:r>
-        <w:rPr>
-          <w:rFonts w:ascii="Times New Roman" w:hAnsi="Times New Roman" w:eastAsia="宋体"/>
-          <w:b/>
-          <w:i w:val="0"/>
-          <w:sz w:val="22"/>
-        </w:rPr>
-        <w:t>“总体设计部”</w:t>
-      </w:r>
-      <w:r>
-        <w:rPr>
-          <w:rFonts w:ascii="Times New Roman" w:hAnsi="Times New Roman" w:eastAsia="宋体"/>
-          <w:b w:val="0"/>
-          <w:i w:val="0"/>
-          <w:sz w:val="22"/>
-        </w:rPr>
-        <w:t>与</w:t>
-      </w:r>
-      <w:r>
-        <w:rPr>
-          <w:rFonts w:ascii="Times New Roman" w:hAnsi="Times New Roman" w:eastAsia="宋体"/>
-          <w:b/>
-          <w:i w:val="0"/>
-          <w:sz w:val="22"/>
-        </w:rPr>
-        <w:t>“综合集成研讨厅”</w:t>
-      </w:r>
-      <w:r>
-        <w:rPr>
-          <w:rFonts w:ascii="Times New Roman" w:hAnsi="Times New Roman" w:eastAsia="宋体"/>
-          <w:b w:val="0"/>
-          <w:i w:val="0"/>
-          <w:sz w:val="22"/>
-        </w:rPr>
-        <w:t>的组织构想。以下我们通过现代流形拓扑、信息论与优化控制理论，对这一假说进行严格的形式化证明。</w:t>
+        <w:t>钱学森先生在晚年高瞻远瞩地指出，治理开放复杂巨系统（OCGS）唯一的科学途径是“从定性到定量综合集成方法（Metasynthetic Method）”。全息抗熵理论的根本性创新，在于首次将系统科学本身“系统化”，重构为一台可运行、自演化的“结构化引擎”。该引擎以“节点（Node）、拓扑关系（Topology）、相互作用（Transition）”为核心代数基底，打通了从“目的论”到“进化论”的物理控制闭环，完成了系统科学从“描述性哲学”向“可计算科学”的范式跃迁。以下我们通过现代流形拓扑、信息论与优化控制理论，对这一假说进行形式化证明。</w:t>
       </w:r>
     </w:p>
     <w:p>

</xml_diff>